<commit_message>
fix: change staff theme ticket in Day mode to light cream paper vintage style to match student tickets style
</commit_message>
<xml_diff>
--- a/(บำรุงกิจกรรมนิสิต)ขออนุมัติเบิกค่าใช้จ่ายโครงการทิศทางแห่งเฟรชชี่ (The freshy bearing).docx
+++ b/(บำรุงกิจกรรมนิสิต)ขออนุมัติเบิกค่าใช้จ่ายโครงการทิศทางแห่งเฟรชชี่ (The freshy bearing).docx
@@ -1023,31 +1023,7 @@
                                 <w:szCs w:val="20"/>
                                 <w:cs/>
                               </w:rPr>
-                              <w:t>นายธนา</w:t>
-                            </w:r>
-                            <w:proofErr w:type="spellStart"/>
-                            <w:r>
-                              <w:rPr>
-                                <w:rFonts w:hint="cs"/>
-                                <w:smallCaps/>
-                                <w:color w:val="000000"/>
-                                <w:sz w:val="20"/>
-                                <w:szCs w:val="20"/>
-                                <w:cs/>
-                              </w:rPr>
-                              <w:t>ธิป</w:t>
-                            </w:r>
-                            <w:proofErr w:type="spellEnd"/>
-                            <w:r>
-                              <w:rPr>
-                                <w:rFonts w:hint="cs"/>
-                                <w:smallCaps/>
-                                <w:color w:val="000000"/>
-                                <w:sz w:val="20"/>
-                                <w:szCs w:val="20"/>
-                                <w:cs/>
-                              </w:rPr>
-                              <w:t xml:space="preserve"> เจ้ากลดี</w:t>
+                              <w:t>นายธนาธิป เจ้ากลดี</w:t>
                             </w:r>
                             <w:r>
                               <w:rPr>
@@ -1065,41 +1041,13 @@
                               <w:jc w:val="center"/>
                               <w:textDirection w:val="btLr"/>
                             </w:pPr>
-                            <w:proofErr w:type="spellStart"/>
                             <w:r>
                               <w:rPr>
                                 <w:smallCaps/>
                                 <w:color w:val="000000"/>
                                 <w:sz w:val="20"/>
                               </w:rPr>
-                              <w:t>นิสิตผู้ยืมเงิน</w:t>
-                            </w:r>
-                            <w:proofErr w:type="spellEnd"/>
-                            <w:r>
-                              <w:rPr>
-                                <w:smallCaps/>
-                                <w:color w:val="000000"/>
-                                <w:sz w:val="20"/>
-                              </w:rPr>
-                              <w:t>(</w:t>
-                            </w:r>
-                            <w:proofErr w:type="spellStart"/>
-                            <w:r>
-                              <w:rPr>
-                                <w:smallCaps/>
-                                <w:color w:val="000000"/>
-                                <w:sz w:val="20"/>
-                              </w:rPr>
-                              <w:t>ประธานโครงการ</w:t>
-                            </w:r>
-                            <w:proofErr w:type="spellEnd"/>
-                            <w:r>
-                              <w:rPr>
-                                <w:smallCaps/>
-                                <w:color w:val="000000"/>
-                                <w:sz w:val="20"/>
-                              </w:rPr>
-                              <w:t>)</w:t>
+                              <w:t>นิสิตผู้ยืมเงิน(ประธานโครงการ)</w:t>
                             </w:r>
                           </w:p>
                           <w:p>
@@ -1155,31 +1103,7 @@
                           <w:szCs w:val="20"/>
                           <w:cs/>
                         </w:rPr>
-                        <w:t>นายธนา</w:t>
-                      </w:r>
-                      <w:proofErr w:type="spellStart"/>
-                      <w:r>
-                        <w:rPr>
-                          <w:rFonts w:hint="cs"/>
-                          <w:smallCaps/>
-                          <w:color w:val="000000"/>
-                          <w:sz w:val="20"/>
-                          <w:szCs w:val="20"/>
-                          <w:cs/>
-                        </w:rPr>
-                        <w:t>ธิป</w:t>
-                      </w:r>
-                      <w:proofErr w:type="spellEnd"/>
-                      <w:r>
-                        <w:rPr>
-                          <w:rFonts w:hint="cs"/>
-                          <w:smallCaps/>
-                          <w:color w:val="000000"/>
-                          <w:sz w:val="20"/>
-                          <w:szCs w:val="20"/>
-                          <w:cs/>
-                        </w:rPr>
-                        <w:t xml:space="preserve"> เจ้ากลดี</w:t>
+                        <w:t>นายธนาธิป เจ้ากลดี</w:t>
                       </w:r>
                       <w:r>
                         <w:rPr>
@@ -1197,41 +1121,13 @@
                         <w:jc w:val="center"/>
                         <w:textDirection w:val="btLr"/>
                       </w:pPr>
-                      <w:proofErr w:type="spellStart"/>
                       <w:r>
                         <w:rPr>
                           <w:smallCaps/>
                           <w:color w:val="000000"/>
                           <w:sz w:val="20"/>
                         </w:rPr>
-                        <w:t>นิสิตผู้ยืมเงิน</w:t>
-                      </w:r>
-                      <w:proofErr w:type="spellEnd"/>
-                      <w:r>
-                        <w:rPr>
-                          <w:smallCaps/>
-                          <w:color w:val="000000"/>
-                          <w:sz w:val="20"/>
-                        </w:rPr>
-                        <w:t>(</w:t>
-                      </w:r>
-                      <w:proofErr w:type="spellStart"/>
-                      <w:r>
-                        <w:rPr>
-                          <w:smallCaps/>
-                          <w:color w:val="000000"/>
-                          <w:sz w:val="20"/>
-                        </w:rPr>
-                        <w:t>ประธานโครงการ</w:t>
-                      </w:r>
-                      <w:proofErr w:type="spellEnd"/>
-                      <w:r>
-                        <w:rPr>
-                          <w:smallCaps/>
-                          <w:color w:val="000000"/>
-                          <w:sz w:val="20"/>
-                        </w:rPr>
-                        <w:t>)</w:t>
+                        <w:t>นิสิตผู้ยืมเงิน(ประธานโครงการ)</w:t>
                       </w:r>
                     </w:p>
                     <w:p>
@@ -1328,19 +1224,7 @@
                                 <w:szCs w:val="20"/>
                                 <w:cs/>
                               </w:rPr>
-                              <w:t>นายอภิสิทธิ์ มังกร</w:t>
-                            </w:r>
-                            <w:proofErr w:type="spellStart"/>
-                            <w:r>
-                              <w:rPr>
-                                <w:rFonts w:hint="cs"/>
-                                <w:smallCaps/>
-                                <w:color w:val="000000"/>
-                                <w:sz w:val="20"/>
-                                <w:szCs w:val="20"/>
-                                <w:cs/>
-                              </w:rPr>
-                              <w:t>คุ</w:t>
+                              <w:t>นายอภิสิทธิ์ มังกรคุ</w:t>
                             </w:r>
                             <w:r>
                               <w:rPr>
@@ -1364,7 +1248,6 @@
                               </w:rPr>
                               <w:t>ธี</w:t>
                             </w:r>
-                            <w:proofErr w:type="spellEnd"/>
                             <w:r>
                               <w:rPr>
                                 <w:smallCaps/>
@@ -1475,19 +1358,7 @@
                           <w:szCs w:val="20"/>
                           <w:cs/>
                         </w:rPr>
-                        <w:t>นายอภิสิทธิ์ มังกร</w:t>
-                      </w:r>
-                      <w:proofErr w:type="spellStart"/>
-                      <w:r>
-                        <w:rPr>
-                          <w:rFonts w:hint="cs"/>
-                          <w:smallCaps/>
-                          <w:color w:val="000000"/>
-                          <w:sz w:val="20"/>
-                          <w:szCs w:val="20"/>
-                          <w:cs/>
-                        </w:rPr>
-                        <w:t>คุ</w:t>
+                        <w:t>นายอภิสิทธิ์ มังกรคุ</w:t>
                       </w:r>
                       <w:r>
                         <w:rPr>
@@ -1511,7 +1382,6 @@
                         </w:rPr>
                         <w:t>ธี</w:t>
                       </w:r>
-                      <w:proofErr w:type="spellEnd"/>
                       <w:r>
                         <w:rPr>
                           <w:smallCaps/>
@@ -2682,21 +2552,8 @@
                 <w:u w:val="dotted"/>
                 <w:cs/>
               </w:rPr>
-              <w:t>นายอภิสิทธิ์ มังกร</w:t>
-            </w:r>
-            <w:proofErr w:type="spellStart"/>
-            <w:r>
-              <w:rPr>
-                <w:rFonts w:eastAsia="Cordia New" w:hint="cs"/>
-                <w:color w:val="EE0000"/>
-                <w:sz w:val="28"/>
-                <w:szCs w:val="28"/>
-                <w:u w:val="dotted"/>
-                <w:cs/>
-              </w:rPr>
-              <w:t>คุนธี</w:t>
-            </w:r>
-            <w:proofErr w:type="spellEnd"/>
+              <w:t>นายอภิสิทธิ์ มังกรคุนธี</w:t>
+            </w:r>
             <w:r>
               <w:rPr>
                 <w:rFonts w:eastAsia="Cordia New" w:hint="cs"/>
@@ -3728,7 +3585,7 @@
               <w:spacing w:after="0" w:line="240" w:lineRule="auto"/>
               <w:jc w:val="center"/>
               <w:rPr>
-                <w:rFonts w:eastAsia="Cordia New" w:hint="cs"/>
+                <w:rFonts w:eastAsia="Cordia New"/>
                 <w:color w:val="EE0000"/>
                 <w:sz w:val="28"/>
                 <w:szCs w:val="28"/>
@@ -4373,7 +4230,7 @@
               <w:spacing w:after="0"/>
               <w:jc w:val="both"/>
               <w:rPr>
-                <w:rFonts w:eastAsia="Cordia New" w:hint="cs"/>
+                <w:rFonts w:eastAsia="Cordia New"/>
                 <w:sz w:val="28"/>
                 <w:szCs w:val="28"/>
               </w:rPr>
@@ -4603,7 +4460,6 @@
               </w:rPr>
               <w:t xml:space="preserve"> </w:t>
             </w:r>
-            <w:proofErr w:type="gramStart"/>
             <w:r>
               <w:rPr>
                 <w:rFonts w:eastAsia="Cordia New" w:hint="cs"/>
@@ -4631,9 +4487,8 @@
                 <w:szCs w:val="28"/>
                 <w:cs/>
               </w:rPr>
-              <w:t>นายอภิสิทธิ์</w:t>
-            </w:r>
-            <w:proofErr w:type="gramEnd"/>
+              <w:t>นายอภิสิทธิ์ มังกรคุนธี</w:t>
+            </w:r>
             <w:r>
               <w:rPr>
                 <w:rFonts w:eastAsia="Cordia New" w:hint="cs"/>
@@ -4644,49 +4499,15 @@
               </w:rPr>
               <w:t xml:space="preserve"> </w:t>
             </w:r>
-            <w:proofErr w:type="gramStart"/>
             <w:r>
               <w:rPr>
                 <w:rFonts w:eastAsia="Cordia New" w:hint="cs"/>
                 <w:color w:val="000000" w:themeColor="text1"/>
                 <w:sz w:val="28"/>
                 <w:szCs w:val="28"/>
-                <w:cs/>
-              </w:rPr>
-              <w:t>มังกร</w:t>
-            </w:r>
-            <w:proofErr w:type="spellStart"/>
-            <w:r>
-              <w:rPr>
-                <w:rFonts w:eastAsia="Cordia New" w:hint="cs"/>
-                <w:color w:val="000000" w:themeColor="text1"/>
-                <w:sz w:val="28"/>
-                <w:szCs w:val="28"/>
-                <w:cs/>
-              </w:rPr>
-              <w:t>คุนธี</w:t>
-            </w:r>
-            <w:proofErr w:type="spellEnd"/>
-            <w:r>
-              <w:rPr>
-                <w:rFonts w:eastAsia="Cordia New" w:hint="cs"/>
-                <w:color w:val="000000" w:themeColor="text1"/>
-                <w:sz w:val="28"/>
-                <w:szCs w:val="28"/>
-                <w:cs/>
-              </w:rPr>
-              <w:t xml:space="preserve"> </w:t>
-            </w:r>
-            <w:r>
-              <w:rPr>
-                <w:rFonts w:eastAsia="Cordia New" w:hint="cs"/>
-                <w:color w:val="000000" w:themeColor="text1"/>
-                <w:sz w:val="28"/>
-                <w:szCs w:val="28"/>
               </w:rPr>
               <w:t>)</w:t>
             </w:r>
-            <w:proofErr w:type="gramEnd"/>
           </w:p>
           <w:p>
             <w:pPr>
@@ -4790,7 +4611,6 @@
               </w:rPr>
               <w:t xml:space="preserve">  </w:t>
             </w:r>
-            <w:proofErr w:type="gramStart"/>
             <w:r>
               <w:rPr>
                 <w:rFonts w:eastAsia="Cordia New" w:hint="cs"/>
@@ -4806,37 +4626,16 @@
                 <w:szCs w:val="28"/>
                 <w:cs/>
               </w:rPr>
-              <w:t xml:space="preserve"> นางสาวพิณทอง</w:t>
-            </w:r>
-            <w:proofErr w:type="gramEnd"/>
+              <w:t xml:space="preserve"> นางสาวพิณทอง ไสวงาม </w:t>
+            </w:r>
             <w:r>
               <w:rPr>
                 <w:rFonts w:eastAsia="Cordia New" w:hint="cs"/>
                 <w:sz w:val="28"/>
                 <w:szCs w:val="28"/>
-                <w:cs/>
-              </w:rPr>
-              <w:t xml:space="preserve"> </w:t>
-            </w:r>
-            <w:proofErr w:type="gramStart"/>
-            <w:r>
-              <w:rPr>
-                <w:rFonts w:eastAsia="Cordia New" w:hint="cs"/>
-                <w:sz w:val="28"/>
-                <w:szCs w:val="28"/>
-                <w:cs/>
-              </w:rPr>
-              <w:t xml:space="preserve">ไสวงาม </w:t>
-            </w:r>
-            <w:r>
-              <w:rPr>
-                <w:rFonts w:eastAsia="Cordia New" w:hint="cs"/>
-                <w:sz w:val="28"/>
-                <w:szCs w:val="28"/>
               </w:rPr>
               <w:t>)</w:t>
             </w:r>
-            <w:proofErr w:type="gramEnd"/>
           </w:p>
           <w:p>
             <w:pPr>
@@ -5170,12 +4969,156 @@
             <w:pPr>
               <w:jc w:val="thaiDistribute"/>
               <w:rPr>
+                <w:rFonts w:ascii="TH SarabunPSK" w:hAnsi="TH SarabunPSK" w:cs="TH SarabunPSK"/>
+                <w:noProof/>
+                <w:sz w:val="28"/>
+                <w:szCs w:val="28"/>
+                <w:lang w:val="en-US"/>
+              </w:rPr>
+            </w:pPr>
+            <w:r>
+              <w:rPr>
+                <w:rFonts w:ascii="TH SarabunPSK" w:hAnsi="TH SarabunPSK" w:cs="TH SarabunPSK"/>
+                <w:noProof/>
+                <w:sz w:val="28"/>
+                <w:szCs w:val="28"/>
+              </w:rPr>
+              <w:t>ร้อยละ</w:t>
+            </w:r>
+            <w:r>
+              <w:rPr>
                 <w:rFonts w:ascii="TH SarabunPSK" w:hAnsi="TH SarabunPSK" w:cs="TH SarabunPSK" w:hint="cs"/>
                 <w:noProof/>
                 <w:sz w:val="28"/>
                 <w:szCs w:val="28"/>
+                <w:cs/>
+              </w:rPr>
+              <w:t xml:space="preserve"> </w:t>
+            </w:r>
+            <w:r>
+              <w:rPr>
+                <w:rFonts w:ascii="TH SarabunPSK" w:hAnsi="TH SarabunPSK" w:cs="TH SarabunPSK"/>
+                <w:noProof/>
+                <w:sz w:val="28"/>
+                <w:szCs w:val="28"/>
+              </w:rPr>
+              <w:t>2</w:t>
+            </w:r>
+            <w:r>
+              <w:rPr>
+                <w:rFonts w:ascii="TH SarabunPSK" w:hAnsi="TH SarabunPSK" w:cs="TH SarabunPSK"/>
+                <w:noProof/>
+                <w:sz w:val="28"/>
+                <w:szCs w:val="28"/>
                 <w:lang w:val="en-US"/>
               </w:rPr>
+              <w:t>4</w:t>
+            </w:r>
+            <w:r>
+              <w:rPr>
+                <w:rFonts w:ascii="TH SarabunPSK" w:hAnsi="TH SarabunPSK" w:cs="TH SarabunPSK" w:hint="cs"/>
+                <w:noProof/>
+                <w:sz w:val="28"/>
+                <w:szCs w:val="28"/>
+                <w:cs/>
+                <w:lang w:val="en-US"/>
+              </w:rPr>
+              <w:t>.</w:t>
+            </w:r>
+            <w:r>
+              <w:rPr>
+                <w:rFonts w:ascii="TH SarabunPSK" w:hAnsi="TH SarabunPSK" w:cs="TH SarabunPSK"/>
+                <w:noProof/>
+                <w:sz w:val="28"/>
+                <w:szCs w:val="28"/>
+                <w:lang w:val="en-US"/>
+              </w:rPr>
+              <w:t>5</w:t>
+            </w:r>
+          </w:p>
+          <w:p>
+            <w:pPr>
+              <w:jc w:val="thaiDistribute"/>
+              <w:rPr>
+                <w:rFonts w:ascii="TH SarabunPSK" w:hAnsi="TH SarabunPSK" w:cs="TH SarabunPSK"/>
+                <w:noProof/>
+                <w:sz w:val="28"/>
+                <w:szCs w:val="28"/>
+              </w:rPr>
+            </w:pPr>
+            <w:r>
+              <w:rPr>
+                <w:rFonts w:ascii="TH SarabunPSK" w:hAnsi="TH SarabunPSK" w:cs="TH SarabunPSK"/>
+                <w:noProof/>
+                <w:sz w:val="28"/>
+                <w:szCs w:val="28"/>
+              </w:rPr>
+              <w:t xml:space="preserve"> ไม่บรรลุ</w:t>
+            </w:r>
+          </w:p>
+        </w:tc>
+        <w:tc>
+          <w:tcPr>
+            <w:tcW w:w="1843" w:type="dxa"/>
+          </w:tcPr>
+          <w:p>
+            <w:pPr>
+              <w:jc w:val="thaiDistribute"/>
+              <w:rPr>
+                <w:rFonts w:ascii="TH SarabunPSK" w:hAnsi="TH SarabunPSK" w:cs="TH SarabunPSK"/>
+                <w:noProof/>
+                <w:sz w:val="28"/>
+                <w:szCs w:val="28"/>
+              </w:rPr>
+            </w:pPr>
+            <w:r>
+              <w:rPr>
+                <w:rFonts w:ascii="TH SarabunPSK" w:hAnsi="TH SarabunPSK" w:cs="TH SarabunPSK"/>
+                <w:noProof/>
+                <w:sz w:val="28"/>
+                <w:szCs w:val="28"/>
+              </w:rPr>
+              <w:t>จำนวน</w:t>
+            </w:r>
+            <w:r>
+              <w:rPr>
+                <w:rFonts w:ascii="TH SarabunPSK" w:hAnsi="TH SarabunPSK" w:cs="TH SarabunPSK" w:hint="cs"/>
+                <w:noProof/>
+                <w:sz w:val="28"/>
+                <w:szCs w:val="28"/>
+                <w:cs/>
+              </w:rPr>
+              <w:t xml:space="preserve"> </w:t>
+            </w:r>
+            <w:r>
+              <w:rPr>
+                <w:rFonts w:ascii="TH SarabunPSK" w:hAnsi="TH SarabunPSK" w:cs="TH SarabunPSK"/>
+                <w:noProof/>
+                <w:sz w:val="28"/>
+                <w:szCs w:val="28"/>
+                <w:lang w:val="en-US"/>
+              </w:rPr>
+              <w:t>4,896</w:t>
+            </w:r>
+            <w:r>
+              <w:rPr>
+                <w:rFonts w:ascii="TH SarabunPSK" w:hAnsi="TH SarabunPSK" w:cs="TH SarabunPSK"/>
+                <w:noProof/>
+                <w:sz w:val="28"/>
+                <w:szCs w:val="28"/>
+              </w:rPr>
+              <w:t>คน</w:t>
+            </w:r>
+          </w:p>
+          <w:p>
+            <w:pPr>
+              <w:jc w:val="thaiDistribute"/>
+              <w:rPr>
+                <w:rFonts w:ascii="TH SarabunPSK" w:hAnsi="TH SarabunPSK" w:cs="TH SarabunPSK"/>
+                <w:noProof/>
+                <w:sz w:val="28"/>
+                <w:szCs w:val="28"/>
+              </w:rPr>
             </w:pPr>
             <w:r>
               <w:rPr>
@@ -5188,79 +5131,38 @@
             </w:r>
             <w:r>
               <w:rPr>
-                <w:rFonts w:ascii="TH SarabunPSK" w:hAnsi="TH SarabunPSK" w:cs="TH SarabunPSK" w:hint="cs"/>
-                <w:noProof/>
-                <w:sz w:val="28"/>
-                <w:szCs w:val="28"/>
-                <w:cs/>
-              </w:rPr>
-              <w:t xml:space="preserve"> </w:t>
-            </w:r>
-            <w:r>
-              <w:rPr>
-                <w:rFonts w:ascii="TH SarabunPSK" w:hAnsi="TH SarabunPSK" w:cs="TH SarabunPSK"/>
-                <w:noProof/>
-                <w:sz w:val="28"/>
-                <w:szCs w:val="28"/>
-              </w:rPr>
-              <w:t>2</w:t>
-            </w:r>
-            <w:r>
-              <w:rPr>
-                <w:rFonts w:ascii="TH SarabunPSK" w:hAnsi="TH SarabunPSK" w:cs="TH SarabunPSK"/>
-                <w:noProof/>
-                <w:sz w:val="28"/>
-                <w:szCs w:val="28"/>
-                <w:lang w:val="en-US"/>
-              </w:rPr>
-              <w:t>4</w:t>
-            </w:r>
-            <w:r>
-              <w:rPr>
-                <w:rFonts w:ascii="TH SarabunPSK" w:hAnsi="TH SarabunPSK" w:cs="TH SarabunPSK" w:hint="cs"/>
-                <w:noProof/>
-                <w:sz w:val="28"/>
-                <w:szCs w:val="28"/>
-                <w:cs/>
-                <w:lang w:val="en-US"/>
-              </w:rPr>
-              <w:t>.</w:t>
-            </w:r>
-            <w:r>
-              <w:rPr>
-                <w:rFonts w:ascii="TH SarabunPSK" w:hAnsi="TH SarabunPSK" w:cs="TH SarabunPSK"/>
-                <w:noProof/>
-                <w:sz w:val="28"/>
-                <w:szCs w:val="28"/>
-                <w:lang w:val="en-US"/>
-              </w:rPr>
-              <w:t>5</w:t>
-            </w:r>
-          </w:p>
-          <w:p>
-            <w:pPr>
-              <w:jc w:val="thaiDistribute"/>
-              <w:rPr>
-                <w:rFonts w:ascii="TH SarabunPSK" w:hAnsi="TH SarabunPSK" w:cs="TH SarabunPSK"/>
-                <w:noProof/>
-                <w:sz w:val="28"/>
-                <w:szCs w:val="28"/>
-              </w:rPr>
-            </w:pPr>
-            <w:r>
-              <w:rPr>
-                <w:rFonts w:ascii="TH SarabunPSK" w:hAnsi="TH SarabunPSK" w:cs="TH SarabunPSK"/>
-                <w:noProof/>
-                <w:sz w:val="28"/>
-                <w:szCs w:val="28"/>
-              </w:rPr>
-              <w:t xml:space="preserve"> ไม่บรรลุ</w:t>
-            </w:r>
-          </w:p>
-        </w:tc>
-        <w:tc>
-          <w:tcPr>
-            <w:tcW w:w="1843" w:type="dxa"/>
+                <w:rFonts w:ascii="TH SarabunPSK" w:hAnsi="TH SarabunPSK" w:cs="TH SarabunPSK"/>
+                <w:noProof/>
+                <w:sz w:val="28"/>
+                <w:szCs w:val="28"/>
+              </w:rPr>
+              <w:t xml:space="preserve"> 174.49</w:t>
+            </w:r>
+          </w:p>
+          <w:p>
+            <w:pPr>
+              <w:jc w:val="thaiDistribute"/>
+              <w:rPr>
+                <w:rFonts w:ascii="TH SarabunPSK" w:eastAsia="Abadi MT Condensed Extra Bold" w:hAnsi="TH SarabunPSK" w:cs="TH SarabunPSK"/>
+                <w:noProof/>
+                <w:sz w:val="28"/>
+                <w:szCs w:val="28"/>
+              </w:rPr>
+            </w:pPr>
+            <w:r>
+              <w:rPr>
+                <w:rFonts w:ascii="TH SarabunPSK" w:hAnsi="TH SarabunPSK" w:cs="TH SarabunPSK"/>
+                <w:noProof/>
+                <w:sz w:val="28"/>
+                <w:szCs w:val="28"/>
+              </w:rPr>
+              <w:t xml:space="preserve"> บรรลุ</w:t>
+            </w:r>
+          </w:p>
+        </w:tc>
+        <w:tc>
+          <w:tcPr>
+            <w:tcW w:w="1842" w:type="dxa"/>
           </w:tcPr>
           <w:p>
             <w:pPr>
@@ -5283,23 +5185,12 @@
             </w:r>
             <w:r>
               <w:rPr>
-                <w:rFonts w:ascii="TH SarabunPSK" w:hAnsi="TH SarabunPSK" w:cs="TH SarabunPSK" w:hint="cs"/>
-                <w:noProof/>
-                <w:sz w:val="28"/>
-                <w:szCs w:val="28"/>
-                <w:cs/>
-              </w:rPr>
-              <w:t xml:space="preserve"> </w:t>
-            </w:r>
-            <w:r>
-              <w:rPr>
-                <w:rFonts w:ascii="TH SarabunPSK" w:hAnsi="TH SarabunPSK" w:cs="TH SarabunPSK"/>
-                <w:noProof/>
-                <w:sz w:val="28"/>
-                <w:szCs w:val="28"/>
-                <w:lang w:val="en-US"/>
-              </w:rPr>
-              <w:t>4,896</w:t>
+                <w:rFonts w:ascii="TH SarabunPSK" w:hAnsi="TH SarabunPSK" w:cs="TH SarabunPSK"/>
+                <w:noProof/>
+                <w:sz w:val="28"/>
+                <w:szCs w:val="28"/>
+              </w:rPr>
+              <w:t xml:space="preserve"> - </w:t>
             </w:r>
             <w:r>
               <w:rPr>
@@ -5337,106 +5228,14 @@
                 <w:sz w:val="28"/>
                 <w:szCs w:val="28"/>
               </w:rPr>
-              <w:t xml:space="preserve"> 174.49</w:t>
-            </w:r>
-          </w:p>
-          <w:p>
-            <w:pPr>
-              <w:jc w:val="thaiDistribute"/>
-              <w:rPr>
-                <w:rFonts w:ascii="TH SarabunPSK" w:eastAsia="Abadi MT Condensed Extra Bold" w:hAnsi="TH SarabunPSK" w:cs="TH SarabunPSK"/>
-                <w:noProof/>
-                <w:sz w:val="28"/>
-                <w:szCs w:val="28"/>
-              </w:rPr>
-            </w:pPr>
-            <w:r>
-              <w:rPr>
-                <w:rFonts w:ascii="TH SarabunPSK" w:hAnsi="TH SarabunPSK" w:cs="TH SarabunPSK"/>
-                <w:noProof/>
-                <w:sz w:val="28"/>
-                <w:szCs w:val="28"/>
-              </w:rPr>
-              <w:t xml:space="preserve"> บรรลุ</w:t>
-            </w:r>
-          </w:p>
-        </w:tc>
-        <w:tc>
-          <w:tcPr>
-            <w:tcW w:w="1842" w:type="dxa"/>
-          </w:tcPr>
-          <w:p>
-            <w:pPr>
-              <w:jc w:val="thaiDistribute"/>
-              <w:rPr>
-                <w:rFonts w:ascii="TH SarabunPSK" w:hAnsi="TH SarabunPSK" w:cs="TH SarabunPSK"/>
-                <w:noProof/>
-                <w:sz w:val="28"/>
-                <w:szCs w:val="28"/>
-              </w:rPr>
-            </w:pPr>
-            <w:r>
-              <w:rPr>
-                <w:rFonts w:ascii="TH SarabunPSK" w:hAnsi="TH SarabunPSK" w:cs="TH SarabunPSK"/>
-                <w:noProof/>
-                <w:sz w:val="28"/>
-                <w:szCs w:val="28"/>
-              </w:rPr>
-              <w:t>จำนวน</w:t>
-            </w:r>
-            <w:r>
-              <w:rPr>
-                <w:rFonts w:ascii="TH SarabunPSK" w:hAnsi="TH SarabunPSK" w:cs="TH SarabunPSK"/>
-                <w:noProof/>
-                <w:sz w:val="28"/>
-                <w:szCs w:val="28"/>
-              </w:rPr>
               <w:t xml:space="preserve"> - </w:t>
             </w:r>
-            <w:r>
-              <w:rPr>
-                <w:rFonts w:ascii="TH SarabunPSK" w:hAnsi="TH SarabunPSK" w:cs="TH SarabunPSK"/>
-                <w:noProof/>
-                <w:sz w:val="28"/>
-                <w:szCs w:val="28"/>
-              </w:rPr>
-              <w:t>คน</w:t>
-            </w:r>
-          </w:p>
-          <w:p>
-            <w:pPr>
-              <w:jc w:val="thaiDistribute"/>
-              <w:rPr>
-                <w:rFonts w:ascii="TH SarabunPSK" w:hAnsi="TH SarabunPSK" w:cs="TH SarabunPSK"/>
-                <w:noProof/>
-                <w:sz w:val="28"/>
-                <w:szCs w:val="28"/>
-              </w:rPr>
-            </w:pPr>
-            <w:r>
-              <w:rPr>
-                <w:rFonts w:ascii="TH SarabunPSK" w:hAnsi="TH SarabunPSK" w:cs="TH SarabunPSK"/>
-                <w:noProof/>
-                <w:sz w:val="28"/>
-                <w:szCs w:val="28"/>
-              </w:rPr>
-              <w:t>ร้อยละ</w:t>
-            </w:r>
-            <w:r>
-              <w:rPr>
-                <w:rFonts w:ascii="TH SarabunPSK" w:hAnsi="TH SarabunPSK" w:cs="TH SarabunPSK"/>
-                <w:noProof/>
-                <w:sz w:val="28"/>
-                <w:szCs w:val="28"/>
-              </w:rPr>
-              <w:t xml:space="preserve"> - </w:t>
-            </w:r>
-          </w:p>
-          <w:p>
-            <w:pPr>
-              <w:jc w:val="thaiDistribute"/>
-              <w:rPr>
-                <w:rFonts w:ascii="TH SarabunPSK" w:hAnsi="TH SarabunPSK" w:cs="TH SarabunPSK" w:hint="cs"/>
+          </w:p>
+          <w:p>
+            <w:pPr>
+              <w:jc w:val="thaiDistribute"/>
+              <w:rPr>
+                <w:rFonts w:ascii="TH SarabunPSK" w:hAnsi="TH SarabunPSK" w:cs="TH SarabunPSK"/>
                 <w:noProof/>
                 <w:sz w:val="28"/>
                 <w:szCs w:val="28"/>
@@ -5773,7 +5572,7 @@
       <w:pPr>
         <w:jc w:val="thaiDistribute"/>
         <w:rPr>
-          <w:rFonts w:ascii="TH SarabunPSK" w:hAnsi="TH SarabunPSK" w:cs="TH SarabunPSK" w:hint="cs"/>
+          <w:rFonts w:ascii="TH SarabunPSK" w:hAnsi="TH SarabunPSK" w:cs="TH SarabunPSK"/>
           <w:b/>
           <w:bCs/>
           <w:noProof/>
@@ -5899,7 +5698,7 @@
       <w:pPr>
         <w:jc w:val="thaiDistribute"/>
         <w:rPr>
-          <w:rFonts w:ascii="TH SarabunPSK" w:hAnsi="TH SarabunPSK" w:cs="TH SarabunPSK" w:hint="cs"/>
+          <w:rFonts w:ascii="TH SarabunPSK" w:hAnsi="TH SarabunPSK" w:cs="TH SarabunPSK"/>
           <w:b/>
           <w:bCs/>
           <w:noProof/>
@@ -6030,7 +5829,7 @@
       <w:pPr>
         <w:jc w:val="thaiDistribute"/>
         <w:rPr>
-          <w:rFonts w:ascii="TH SarabunPSK" w:hAnsi="TH SarabunPSK" w:cs="TH SarabunPSK" w:hint="cs"/>
+          <w:rFonts w:ascii="TH SarabunPSK" w:hAnsi="TH SarabunPSK" w:cs="TH SarabunPSK"/>
           <w:b/>
           <w:bCs/>
           <w:noProof/>
@@ -6271,7 +6070,17 @@
           <w:szCs w:val="28"/>
         </w:rPr>
         <w:tab/>
-        <w:t>__________</w:t>
+        <w:t>_________</w:t>
+      </w:r>
+      <w:r>
+        <w:rPr>
+          <w:rFonts w:ascii="TH SarabunPSK" w:hAnsi="TH SarabunPSK" w:cs="TH SarabunPSK"/>
+          <w:noProof/>
+          <w:color w:val="000000"/>
+          <w:sz w:val="28"/>
+          <w:szCs w:val="28"/>
+        </w:rPr>
+        <w:t>176</w:t>
       </w:r>
       <w:r>
         <w:rPr>
@@ -6282,7 +6091,17 @@
           <w:szCs w:val="28"/>
           <w:cs/>
         </w:rPr>
-        <w:t>57,</w:t>
+        <w:t>,</w:t>
+      </w:r>
+      <w:r>
+        <w:rPr>
+          <w:rFonts w:ascii="TH SarabunPSK" w:hAnsi="TH SarabunPSK" w:cs="TH SarabunPSK"/>
+          <w:noProof/>
+          <w:color w:val="000000"/>
+          <w:sz w:val="28"/>
+          <w:szCs w:val="28"/>
+        </w:rPr>
+        <w:t>5</w:t>
       </w:r>
       <w:r>
         <w:rPr>
@@ -6293,7 +6112,7 @@
           <w:szCs w:val="28"/>
           <w:cs/>
         </w:rPr>
-        <w:t>63</w:t>
+        <w:t>3</w:t>
       </w:r>
       <w:r>
         <w:rPr>
@@ -6400,7 +6219,17 @@
           <w:szCs w:val="28"/>
           <w:cs/>
         </w:rPr>
-        <w:t>11</w:t>
+        <w:t>_</w:t>
+      </w:r>
+      <w:r>
+        <w:rPr>
+          <w:rFonts w:ascii="TH SarabunPSK" w:hAnsi="TH SarabunPSK" w:cs="TH SarabunPSK"/>
+          <w:noProof/>
+          <w:color w:val="000000"/>
+          <w:sz w:val="28"/>
+          <w:szCs w:val="28"/>
+        </w:rPr>
+        <w:t xml:space="preserve">___ </w:t>
       </w:r>
       <w:r>
         <w:rPr>
@@ -6411,29 +6240,7 @@
           <w:szCs w:val="28"/>
           <w:cs/>
         </w:rPr>
-        <w:t>8</w:t>
-      </w:r>
-      <w:r>
-        <w:rPr>
-          <w:rFonts w:ascii="TH SarabunPSK" w:hAnsi="TH SarabunPSK" w:cs="TH SarabunPSK" w:hint="cs"/>
-          <w:noProof/>
-          <w:color w:val="000000"/>
-          <w:sz w:val="28"/>
-          <w:szCs w:val="28"/>
-          <w:cs/>
-        </w:rPr>
-        <w:t>,</w:t>
-      </w:r>
-      <w:r>
-        <w:rPr>
-          <w:rFonts w:ascii="TH SarabunPSK" w:hAnsi="TH SarabunPSK" w:cs="TH SarabunPSK" w:hint="cs"/>
-          <w:noProof/>
-          <w:color w:val="000000"/>
-          <w:sz w:val="28"/>
-          <w:szCs w:val="28"/>
-          <w:cs/>
-        </w:rPr>
-        <w:t>92</w:t>
+        <w:t>2</w:t>
       </w:r>
       <w:r>
         <w:rPr>
@@ -6540,7 +6347,7 @@
           <w:szCs w:val="28"/>
           <w:cs/>
         </w:rPr>
-        <w:t>2</w:t>
+        <w:t>3</w:t>
       </w:r>
       <w:r>
         <w:rPr>
@@ -20412,18 +20219,32 @@
             <w:pPr>
               <w:jc w:val="thaiDistribute"/>
               <w:rPr>
-                <w:rFonts w:ascii="TH SarabunPSK" w:hAnsi="TH SarabunPSK" w:cs="TH SarabunPSK"/>
-                <w:b/>
-                <w:bCs/>
-                <w:i/>
-                <w:iCs/>
-                <w:noProof/>
-                <w:color w:val="000000" w:themeColor="text1"/>
-                <w:sz w:val="28"/>
-                <w:szCs w:val="28"/>
-                <w:cs/>
-              </w:rPr>
-            </w:pPr>
+                <w:rFonts w:ascii="TH SarabunPSK" w:hAnsi="TH SarabunPSK" w:cs="TH SarabunPSK" w:hint="cs"/>
+                <w:b/>
+                <w:bCs/>
+                <w:i/>
+                <w:iCs/>
+                <w:noProof/>
+                <w:color w:val="000000" w:themeColor="text1"/>
+                <w:sz w:val="28"/>
+                <w:szCs w:val="28"/>
+                <w:cs/>
+              </w:rPr>
+            </w:pPr>
+            <w:r>
+              <w:rPr>
+                <w:rFonts w:ascii="TH SarabunPSK" w:hAnsi="TH SarabunPSK" w:cs="TH SarabunPSK"/>
+                <w:b/>
+                <w:bCs/>
+                <w:i/>
+                <w:iCs/>
+                <w:noProof/>
+                <w:color w:val="000000" w:themeColor="text1"/>
+                <w:sz w:val="28"/>
+                <w:szCs w:val="28"/>
+              </w:rPr>
+              <w:t>63</w:t>
+            </w:r>
           </w:p>
         </w:tc>
         <w:tc>
@@ -20432,6 +20253,173 @@
           </w:tcPr>
           <w:p>
             <w:pPr>
+              <w:rPr>
+                <w:color w:val="000000" w:themeColor="text1"/>
+                <w:sz w:val="28"/>
+                <w:szCs w:val="28"/>
+              </w:rPr>
+            </w:pPr>
+            <w:r>
+              <w:rPr>
+                <w:rFonts w:hint="cs"/>
+                <w:color w:val="000000" w:themeColor="text1"/>
+                <w:sz w:val="28"/>
+                <w:szCs w:val="28"/>
+                <w:cs/>
+              </w:rPr>
+              <w:t xml:space="preserve">ใบสำคัญรับเงิน นางสาวนรีรัศม์ ชัยวิริยะกิจ </w:t>
+            </w:r>
+          </w:p>
+          <w:p>
+            <w:pPr>
+              <w:rPr>
+                <w:rFonts w:hint="cs"/>
+                <w:color w:val="000000" w:themeColor="text1"/>
+                <w:sz w:val="28"/>
+                <w:szCs w:val="28"/>
+                <w:cs/>
+              </w:rPr>
+            </w:pPr>
+            <w:r>
+              <w:rPr>
+                <w:rFonts w:hint="cs"/>
+                <w:color w:val="000000" w:themeColor="text1"/>
+                <w:sz w:val="28"/>
+                <w:szCs w:val="28"/>
+                <w:cs/>
+              </w:rPr>
+              <w:t>ลงวันที่ 2 กรกฎาคม 2569</w:t>
+            </w:r>
+          </w:p>
+        </w:tc>
+        <w:tc>
+          <w:tcPr>
+            <w:tcW w:w="1170" w:type="dxa"/>
+          </w:tcPr>
+          <w:p>
+            <w:pPr>
+              <w:jc w:val="right"/>
+              <w:rPr>
+                <w:rFonts w:ascii="TH SarabunPSK" w:hAnsi="TH SarabunPSK" w:cs="TH SarabunPSK" w:hint="cs"/>
+                <w:b/>
+                <w:bCs/>
+                <w:i/>
+                <w:iCs/>
+                <w:noProof/>
+                <w:color w:val="000000" w:themeColor="text1"/>
+                <w:sz w:val="28"/>
+                <w:szCs w:val="28"/>
+                <w:cs/>
+              </w:rPr>
+            </w:pPr>
+          </w:p>
+        </w:tc>
+        <w:tc>
+          <w:tcPr>
+            <w:tcW w:w="990" w:type="dxa"/>
+          </w:tcPr>
+          <w:p>
+            <w:pPr>
+              <w:jc w:val="thaiDistribute"/>
+              <w:rPr>
+                <w:rFonts w:ascii="TH SarabunPSK" w:hAnsi="TH SarabunPSK" w:cs="TH SarabunPSK"/>
+                <w:b/>
+                <w:bCs/>
+                <w:i/>
+                <w:iCs/>
+                <w:noProof/>
+                <w:color w:val="FF0000"/>
+                <w:sz w:val="28"/>
+                <w:szCs w:val="28"/>
+              </w:rPr>
+            </w:pPr>
+          </w:p>
+        </w:tc>
+        <w:tc>
+          <w:tcPr>
+            <w:tcW w:w="1350" w:type="dxa"/>
+          </w:tcPr>
+          <w:p>
+            <w:pPr>
+              <w:jc w:val="thaiDistribute"/>
+              <w:rPr>
+                <w:rFonts w:ascii="TH SarabunPSK" w:hAnsi="TH SarabunPSK" w:cs="TH SarabunPSK"/>
+                <w:b/>
+                <w:bCs/>
+                <w:i/>
+                <w:iCs/>
+                <w:noProof/>
+                <w:color w:val="000000" w:themeColor="text1"/>
+                <w:sz w:val="28"/>
+                <w:szCs w:val="28"/>
+                <w:cs/>
+              </w:rPr>
+            </w:pPr>
+            <w:r>
+              <w:rPr>
+                <w:rFonts w:ascii="TH SarabunPSK" w:hAnsi="TH SarabunPSK" w:cs="TH SarabunPSK" w:hint="cs"/>
+                <w:b/>
+                <w:bCs/>
+                <w:i/>
+                <w:iCs/>
+                <w:noProof/>
+                <w:color w:val="000000" w:themeColor="text1"/>
+                <w:sz w:val="28"/>
+                <w:szCs w:val="28"/>
+                <w:cs/>
+              </w:rPr>
+              <w:t>118,900</w:t>
+            </w:r>
+          </w:p>
+        </w:tc>
+        <w:tc>
+          <w:tcPr>
+            <w:tcW w:w="1260" w:type="dxa"/>
+          </w:tcPr>
+          <w:p>
+            <w:pPr>
+              <w:jc w:val="thaiDistribute"/>
+              <w:rPr>
+                <w:rFonts w:ascii="TH SarabunPSK" w:hAnsi="TH SarabunPSK" w:cs="TH SarabunPSK"/>
+                <w:b/>
+                <w:bCs/>
+                <w:noProof/>
+                <w:sz w:val="28"/>
+                <w:szCs w:val="28"/>
+              </w:rPr>
+            </w:pPr>
+          </w:p>
+        </w:tc>
+      </w:tr>
+      <w:tr>
+        <w:tc>
+          <w:tcPr>
+            <w:tcW w:w="708" w:type="dxa"/>
+          </w:tcPr>
+          <w:p>
+            <w:pPr>
+              <w:jc w:val="thaiDistribute"/>
+              <w:rPr>
+                <w:rFonts w:ascii="TH SarabunPSK" w:hAnsi="TH SarabunPSK" w:cs="TH SarabunPSK"/>
+                <w:b/>
+                <w:bCs/>
+                <w:i/>
+                <w:iCs/>
+                <w:noProof/>
+                <w:color w:val="000000" w:themeColor="text1"/>
+                <w:sz w:val="28"/>
+                <w:szCs w:val="28"/>
+                <w:cs/>
+              </w:rPr>
+            </w:pPr>
+          </w:p>
+        </w:tc>
+        <w:tc>
+          <w:tcPr>
+            <w:tcW w:w="4152" w:type="dxa"/>
+          </w:tcPr>
+          <w:p>
+            <w:pPr>
               <w:jc w:val="center"/>
               <w:rPr>
                 <w:noProof/>
@@ -20534,32 +20522,46 @@
             <w:pPr>
               <w:jc w:val="right"/>
               <w:rPr>
-                <w:rFonts w:ascii="TH SarabunPSK" w:hAnsi="TH SarabunPSK" w:cs="TH SarabunPSK"/>
-                <w:b/>
-                <w:bCs/>
-                <w:i/>
-                <w:iCs/>
-                <w:noProof/>
-                <w:color w:val="000000" w:themeColor="text1"/>
-                <w:sz w:val="28"/>
-                <w:szCs w:val="28"/>
-                <w:cs/>
-              </w:rPr>
-            </w:pPr>
-            <w:r>
-              <w:rPr>
-                <w:rFonts w:ascii="TH SarabunPSK" w:hAnsi="TH SarabunPSK" w:cs="TH SarabunPSK"/>
-                <w:b/>
-                <w:bCs/>
-                <w:i/>
-                <w:iCs/>
-                <w:noProof/>
-                <w:color w:val="000000" w:themeColor="text1"/>
-                <w:sz w:val="28"/>
-                <w:szCs w:val="28"/>
-                <w:cs/>
-              </w:rPr>
-              <w:t>52,764</w:t>
+                <w:rFonts w:ascii="TH SarabunPSK" w:hAnsi="TH SarabunPSK" w:cs="TH SarabunPSK" w:hint="cs"/>
+                <w:b/>
+                <w:bCs/>
+                <w:i/>
+                <w:iCs/>
+                <w:noProof/>
+                <w:color w:val="000000" w:themeColor="text1"/>
+                <w:sz w:val="28"/>
+                <w:szCs w:val="28"/>
+                <w:cs/>
+              </w:rPr>
+            </w:pPr>
+            <w:r>
+              <w:rPr>
+                <w:rFonts w:ascii="TH SarabunPSK" w:hAnsi="TH SarabunPSK" w:cs="TH SarabunPSK"/>
+                <w:b/>
+                <w:bCs/>
+                <w:i/>
+                <w:iCs/>
+                <w:noProof/>
+                <w:color w:val="000000" w:themeColor="text1"/>
+                <w:sz w:val="28"/>
+                <w:szCs w:val="28"/>
+              </w:rPr>
+              <w:t>171</w:t>
+            </w:r>
+            <w:r>
+              <w:rPr>
+                <w:rFonts w:ascii="TH SarabunPSK" w:hAnsi="TH SarabunPSK" w:cs="TH SarabunPSK" w:hint="cs"/>
+                <w:b/>
+                <w:bCs/>
+                <w:i/>
+                <w:iCs/>
+                <w:noProof/>
+                <w:color w:val="000000" w:themeColor="text1"/>
+                <w:sz w:val="28"/>
+                <w:szCs w:val="28"/>
+                <w:cs/>
+              </w:rPr>
+              <w:t>,664</w:t>
             </w:r>
           </w:p>
         </w:tc>
@@ -20630,7 +20632,18 @@
           <w:sz w:val="28"/>
           <w:szCs w:val="28"/>
         </w:rPr>
-        <w:t>รวมเป็นเงินทั้งสิ้น</w:t>
+        <w:t>รวมเป็นเงินทั้งสิ้</w:t>
+      </w:r>
+      <w:r>
+        <w:rPr>
+          <w:rFonts w:ascii="TH SarabunPSK" w:hAnsi="TH SarabunPSK" w:cs="TH SarabunPSK" w:hint="cs"/>
+          <w:noProof/>
+          <w:color w:val="000000"/>
+          <w:sz w:val="28"/>
+          <w:szCs w:val="28"/>
+          <w:cs/>
+        </w:rPr>
+        <w:t>น 176,534</w:t>
       </w:r>
       <w:r>
         <w:rPr>
@@ -20641,29 +20654,7 @@
           <w:szCs w:val="28"/>
           <w:cs/>
         </w:rPr>
-        <w:t xml:space="preserve"> 57,</w:t>
-      </w:r>
-      <w:r>
-        <w:rPr>
-          <w:rFonts w:ascii="TH SarabunPSK" w:hAnsi="TH SarabunPSK" w:cs="TH SarabunPSK" w:hint="cs"/>
-          <w:noProof/>
-          <w:color w:val="000000"/>
-          <w:sz w:val="28"/>
-          <w:szCs w:val="28"/>
-          <w:cs/>
-        </w:rPr>
-        <w:t>63</w:t>
-      </w:r>
-      <w:r>
-        <w:rPr>
-          <w:rFonts w:ascii="TH SarabunPSK" w:hAnsi="TH SarabunPSK" w:cs="TH SarabunPSK"/>
-          <w:noProof/>
-          <w:color w:val="000000"/>
-          <w:sz w:val="28"/>
-          <w:szCs w:val="28"/>
-          <w:cs/>
-        </w:rPr>
-        <w:t xml:space="preserve">4 </w:t>
+        <w:t xml:space="preserve"> </w:t>
       </w:r>
       <w:r>
         <w:rPr>
@@ -20698,17 +20689,6 @@
       </w:r>
       <w:r>
         <w:rPr>
-          <w:rFonts w:ascii="TH SarabunPSK" w:hAnsi="TH SarabunPSK" w:cs="TH SarabunPSK"/>
-          <w:noProof/>
-          <w:color w:val="000000"/>
-          <w:sz w:val="28"/>
-          <w:szCs w:val="28"/>
-          <w:cs/>
-        </w:rPr>
-        <w:t>ห้าหมื่นเจ็ดพัน</w:t>
-      </w:r>
-      <w:r>
-        <w:rPr>
           <w:rFonts w:ascii="TH SarabunPSK" w:hAnsi="TH SarabunPSK" w:cs="TH SarabunPSK" w:hint="cs"/>
           <w:noProof/>
           <w:color w:val="000000"/>
@@ -20716,7 +20696,7 @@
           <w:szCs w:val="28"/>
           <w:cs/>
         </w:rPr>
-        <w:t>หกร้อยสามสิบ</w:t>
+        <w:t>หนึ่งแสนเจ็ดหมื่นหกพันห้าร้อยสามสิบสี่</w:t>
       </w:r>
       <w:r>
         <w:rPr>
@@ -20727,7 +20707,7 @@
           <w:szCs w:val="28"/>
           <w:cs/>
         </w:rPr>
-        <w:t>สี่บาทถ้วน</w:t>
+        <w:t>บาทถ้วน</w:t>
       </w:r>
       <w:r>
         <w:rPr>
@@ -21092,7 +21072,7 @@
         </w:pBdr>
         <w:jc w:val="thaiDistribute"/>
         <w:rPr>
-          <w:rFonts w:ascii="TH SarabunPSK" w:hAnsi="TH SarabunPSK" w:cs="TH SarabunPSK" w:hint="cs"/>
+          <w:rFonts w:ascii="TH SarabunPSK" w:hAnsi="TH SarabunPSK" w:cs="TH SarabunPSK"/>
           <w:noProof/>
           <w:color w:val="000000"/>
           <w:sz w:val="28"/>
@@ -21908,6 +21888,7 @@
   <w:style w:type="character" w:default="1" w:styleId="DefaultParagraphFont">
     <w:name w:val="Default Paragraph Font"/>
     <w:uiPriority w:val="1"/>
+    <w:semiHidden/>
     <w:unhideWhenUsed/>
   </w:style>
   <w:style w:type="table" w:default="1" w:styleId="TableNormal">

</xml_diff>